<commit_message>
chore: add owner figure and table review documents
Co-Authored-By: Claude Fable 5 <noreply@anthropic.com>
</commit_message>
<xml_diff>
--- a/docs/Figures&Tables07252026.docx
+++ b/docs/Figures&Tables07252026.docx
@@ -5655,21 +5655,127 @@
             </w:pPr>
             <w:r>
               <w:rPr>
+                <w:rFonts w:ascii="Times New Roman" w:hAnsi="Times New Roman"/>
+                <w:sz w:val="15"/>
+              </w:rPr>
+              <w:t>(8.6 ± 0.8)×10⁻⁵ / (2.8 ± 0.7)×10⁻⁵ / (1.2 ± 0.3)×10⁻⁵</w:t>
+            </w:r>
+          </w:p>
+        </w:tc>
+        <w:tc>
+          <w:tcPr>
+            <w:tcW w:w="1936" w:type="dxa"/>
+          </w:tcPr>
+          <w:p>
+            <w:pPr>
+              <w:pStyle w:val="ListParagraph"/>
+              <w:spacing w:before="120" w:after="120" w:line="360" w:lineRule="auto"/>
+              <w:ind w:left="0"/>
+              <w:jc w:val="center"/>
+              <w:rPr>
+                <w:rFonts w:ascii="Times New Roman" w:hAnsi="Times New Roman" w:cs="Times New Roman"/>
+                <w:iCs/>
+                <w:color w:val="000000" w:themeColor="text1"/>
+                <w:sz w:val="15"/>
+                <w:szCs w:val="15"/>
+              </w:rPr>
+            </w:pPr>
+            <w:r>
+              <w:rPr>
+                <w:rFonts w:ascii="Times New Roman" w:hAnsi="Times New Roman" w:cs="Times New Roman"/>
+                <w:iCs/>
+                <w:color w:val="000000" w:themeColor="text1"/>
+                <w:sz w:val="15"/>
+                <w:szCs w:val="15"/>
+              </w:rPr>
+              <w:t>55 / 75 / 87</w:t>
+            </w:r>
+          </w:p>
+        </w:tc>
+        <w:tc>
+          <w:tcPr>
+            <w:tcW w:w="1483" w:type="dxa"/>
+          </w:tcPr>
+          <w:p>
+            <w:pPr>
+              <w:pStyle w:val="ListParagraph"/>
+              <w:spacing w:before="120" w:after="120" w:line="360" w:lineRule="auto"/>
+              <w:ind w:left="0"/>
+              <w:jc w:val="center"/>
+              <w:rPr>
+                <w:rFonts w:ascii="Times New Roman" w:hAnsi="Times New Roman" w:cs="Times New Roman"/>
+                <w:iCs/>
+                <w:color w:val="000000" w:themeColor="text1"/>
+                <w:sz w:val="15"/>
+                <w:szCs w:val="15"/>
+              </w:rPr>
+            </w:pPr>
+            <w:r>
+              <w:rPr>
+                <w:rFonts w:ascii="Times New Roman" w:hAnsi="Times New Roman" w:cs="Times New Roman"/>
+                <w:iCs/>
+                <w:color w:val="000000" w:themeColor="text1"/>
+                <w:sz w:val="15"/>
+                <w:szCs w:val="15"/>
+              </w:rPr>
+              <w:t xml:space="preserve">Verified </w:t>
+            </w:r>
+          </w:p>
+        </w:tc>
+      </w:tr>
+      <w:tr>
+        <w:trPr>
+          <w:trHeight w:val="647"/>
+        </w:trPr>
+        <w:tc>
+          <w:tcPr>
+            <w:tcW w:w="1710" w:type="dxa"/>
+          </w:tcPr>
+          <w:p>
+            <w:pPr>
+              <w:pStyle w:val="ListParagraph"/>
+              <w:spacing w:before="120" w:after="120" w:line="360" w:lineRule="auto"/>
+              <w:ind w:left="0"/>
+              <w:jc w:val="center"/>
+              <w:rPr>
+                <w:rFonts w:ascii="Times New Roman" w:hAnsi="Times New Roman" w:cs="Times New Roman"/>
+                <w:iCs/>
+                <w:color w:val="000000" w:themeColor="text1"/>
+                <w:sz w:val="15"/>
+                <w:szCs w:val="15"/>
+              </w:rPr>
+            </w:pPr>
+            <w:r>
+              <w:rPr>
+                <w:rFonts w:ascii="Times New Roman" w:hAnsi="Times New Roman" w:cs="Times New Roman"/>
+                <w:iCs/>
+                <w:color w:val="000000" w:themeColor="text1"/>
+                <w:sz w:val="15"/>
+                <w:szCs w:val="15"/>
+              </w:rPr>
+              <w:t>w/o MC-BR polishing</w:t>
+            </w:r>
+          </w:p>
+        </w:tc>
+        <w:tc>
+          <w:tcPr>
+            <w:tcW w:w="2409" w:type="dxa"/>
+          </w:tcPr>
+          <w:p>
+            <w:pPr>
+              <w:pStyle w:val="ListParagraph"/>
+              <w:spacing w:before="120" w:after="120" w:line="360" w:lineRule="auto"/>
+              <w:ind w:left="0"/>
+              <w:jc w:val="center"/>
+              <w:rPr>
                 <w:rFonts w:ascii="Times New Roman" w:hAnsi="Times New Roman" w:cs="Times New Roman"/>
                 <w:iCs/>
                 <w:color w:val="EE0000"/>
                 <w:sz w:val="15"/>
                 <w:szCs w:val="15"/>
               </w:rPr>
-              <w:t>8.6×10⁻⁵ /</w:t>
-            </w:r>
-          </w:p>
-          <w:p>
-            <w:pPr>
-              <w:pStyle w:val="ListParagraph"/>
-              <w:spacing w:before="120" w:after="120" w:line="360" w:lineRule="auto"/>
-              <w:ind w:left="0"/>
-              <w:jc w:val="center"/>
+            </w:pPr>
+            <w:r>
               <w:rPr>
                 <w:rFonts w:ascii="Times New Roman" w:hAnsi="Times New Roman" w:cs="Times New Roman"/>
                 <w:iCs/>
@@ -5677,8 +5783,15 @@
                 <w:sz w:val="15"/>
                 <w:szCs w:val="15"/>
               </w:rPr>
-            </w:pPr>
-            <w:r>
+              <w:t xml:space="preserve">1.87 (±1.25) / </w:t>
+            </w:r>
+          </w:p>
+          <w:p>
+            <w:pPr>
+              <w:pStyle w:val="ListParagraph"/>
+              <w:spacing w:before="120" w:after="120" w:line="360" w:lineRule="auto"/>
+              <w:ind w:left="0"/>
+              <w:jc w:val="center"/>
               <w:rPr>
                 <w:rFonts w:ascii="Times New Roman" w:hAnsi="Times New Roman" w:cs="Times New Roman"/>
                 <w:iCs/>
@@ -5686,15 +5799,8 @@
                 <w:sz w:val="15"/>
                 <w:szCs w:val="15"/>
               </w:rPr>
-              <w:t xml:space="preserve"> 2.7×10⁻⁵ / </w:t>
-            </w:r>
-          </w:p>
-          <w:p>
-            <w:pPr>
-              <w:pStyle w:val="ListParagraph"/>
-              <w:spacing w:before="120" w:after="120" w:line="360" w:lineRule="auto"/>
-              <w:ind w:left="0"/>
-              <w:jc w:val="center"/>
+            </w:pPr>
+            <w:r>
               <w:rPr>
                 <w:rFonts w:ascii="Times New Roman" w:hAnsi="Times New Roman" w:cs="Times New Roman"/>
                 <w:iCs/>
@@ -5702,8 +5808,15 @@
                 <w:sz w:val="15"/>
                 <w:szCs w:val="15"/>
               </w:rPr>
-            </w:pPr>
-            <w:r>
+              <w:t xml:space="preserve">0.11 (±0.60) / </w:t>
+            </w:r>
+          </w:p>
+          <w:p>
+            <w:pPr>
+              <w:pStyle w:val="ListParagraph"/>
+              <w:spacing w:before="120" w:after="120" w:line="360" w:lineRule="auto"/>
+              <w:ind w:left="0"/>
+              <w:jc w:val="center"/>
               <w:rPr>
                 <w:rFonts w:ascii="Times New Roman" w:hAnsi="Times New Roman" w:cs="Times New Roman"/>
                 <w:iCs/>
@@ -5711,115 +5824,8 @@
                 <w:sz w:val="15"/>
                 <w:szCs w:val="15"/>
               </w:rPr>
-              <w:t>1.1×10⁻⁵ ᵈᵉᵗ</w:t>
-            </w:r>
-          </w:p>
-        </w:tc>
-        <w:tc>
-          <w:tcPr>
-            <w:tcW w:w="1936" w:type="dxa"/>
-          </w:tcPr>
-          <w:p>
-            <w:pPr>
-              <w:pStyle w:val="ListParagraph"/>
-              <w:spacing w:before="120" w:after="120" w:line="360" w:lineRule="auto"/>
-              <w:ind w:left="0"/>
-              <w:jc w:val="center"/>
-              <w:rPr>
-                <w:rFonts w:ascii="Times New Roman" w:hAnsi="Times New Roman" w:cs="Times New Roman"/>
-                <w:iCs/>
-                <w:color w:val="000000" w:themeColor="text1"/>
-                <w:sz w:val="15"/>
-                <w:szCs w:val="15"/>
-              </w:rPr>
-            </w:pPr>
-            <w:r>
-              <w:rPr>
-                <w:rFonts w:ascii="Times New Roman" w:hAnsi="Times New Roman" w:cs="Times New Roman"/>
-                <w:iCs/>
-                <w:color w:val="000000" w:themeColor="text1"/>
-                <w:sz w:val="15"/>
-                <w:szCs w:val="15"/>
-              </w:rPr>
-              <w:t>55 / 75 / 87</w:t>
-            </w:r>
-          </w:p>
-        </w:tc>
-        <w:tc>
-          <w:tcPr>
-            <w:tcW w:w="1483" w:type="dxa"/>
-          </w:tcPr>
-          <w:p>
-            <w:pPr>
-              <w:pStyle w:val="ListParagraph"/>
-              <w:spacing w:before="120" w:after="120" w:line="360" w:lineRule="auto"/>
-              <w:ind w:left="0"/>
-              <w:jc w:val="center"/>
-              <w:rPr>
-                <w:rFonts w:ascii="Times New Roman" w:hAnsi="Times New Roman" w:cs="Times New Roman"/>
-                <w:iCs/>
-                <w:color w:val="000000" w:themeColor="text1"/>
-                <w:sz w:val="15"/>
-                <w:szCs w:val="15"/>
-              </w:rPr>
-            </w:pPr>
-            <w:r>
-              <w:rPr>
-                <w:rFonts w:ascii="Times New Roman" w:hAnsi="Times New Roman" w:cs="Times New Roman"/>
-                <w:iCs/>
-                <w:color w:val="000000" w:themeColor="text1"/>
-                <w:sz w:val="15"/>
-                <w:szCs w:val="15"/>
-              </w:rPr>
-              <w:t xml:space="preserve">Verified </w:t>
-            </w:r>
-          </w:p>
-        </w:tc>
-      </w:tr>
-      <w:tr>
-        <w:trPr>
-          <w:trHeight w:val="647"/>
-        </w:trPr>
-        <w:tc>
-          <w:tcPr>
-            <w:tcW w:w="1710" w:type="dxa"/>
-          </w:tcPr>
-          <w:p>
-            <w:pPr>
-              <w:pStyle w:val="ListParagraph"/>
-              <w:spacing w:before="120" w:after="120" w:line="360" w:lineRule="auto"/>
-              <w:ind w:left="0"/>
-              <w:jc w:val="center"/>
-              <w:rPr>
-                <w:rFonts w:ascii="Times New Roman" w:hAnsi="Times New Roman" w:cs="Times New Roman"/>
-                <w:iCs/>
-                <w:color w:val="000000" w:themeColor="text1"/>
-                <w:sz w:val="15"/>
-                <w:szCs w:val="15"/>
-              </w:rPr>
-            </w:pPr>
-            <w:r>
-              <w:rPr>
-                <w:rFonts w:ascii="Times New Roman" w:hAnsi="Times New Roman" w:cs="Times New Roman"/>
-                <w:iCs/>
-                <w:color w:val="000000" w:themeColor="text1"/>
-                <w:sz w:val="15"/>
-                <w:szCs w:val="15"/>
-              </w:rPr>
-              <w:t>w/o MC-BR polishing</w:t>
-            </w:r>
-          </w:p>
-        </w:tc>
-        <w:tc>
-          <w:tcPr>
-            <w:tcW w:w="2409" w:type="dxa"/>
-          </w:tcPr>
-          <w:p>
-            <w:pPr>
-              <w:pStyle w:val="ListParagraph"/>
-              <w:spacing w:before="120" w:after="120" w:line="360" w:lineRule="auto"/>
-              <w:ind w:left="0"/>
-              <w:jc w:val="center"/>
+            </w:pPr>
+            <w:r>
               <w:rPr>
                 <w:rFonts w:ascii="Times New Roman" w:hAnsi="Times New Roman" w:cs="Times New Roman"/>
                 <w:iCs/>
@@ -5827,8 +5833,20 @@
                 <w:sz w:val="15"/>
                 <w:szCs w:val="15"/>
               </w:rPr>
-            </w:pPr>
-            <w:r>
+              <w:t>0.73 (±0.76)</w:t>
+            </w:r>
+          </w:p>
+        </w:tc>
+        <w:tc>
+          <w:tcPr>
+            <w:tcW w:w="1641" w:type="dxa"/>
+          </w:tcPr>
+          <w:p>
+            <w:pPr>
+              <w:pStyle w:val="ListParagraph"/>
+              <w:spacing w:before="120" w:after="120" w:line="360" w:lineRule="auto"/>
+              <w:ind w:left="0"/>
+              <w:jc w:val="center"/>
               <w:rPr>
                 <w:rFonts w:ascii="Times New Roman" w:hAnsi="Times New Roman" w:cs="Times New Roman"/>
                 <w:iCs/>
@@ -5836,9 +5854,115 @@
                 <w:sz w:val="15"/>
                 <w:szCs w:val="15"/>
               </w:rPr>
-              <w:t xml:space="preserve">1.87 (±1.25) / </w:t>
-            </w:r>
-          </w:p>
+            </w:pPr>
+            <w:r>
+              <w:rPr>
+                <w:rFonts w:ascii="Times New Roman" w:hAnsi="Times New Roman"/>
+                <w:sz w:val="15"/>
+              </w:rPr>
+              <w:t>(1.6 ± 1.6)×10⁻³ / (2.1 ± 1.2)×10⁻⁴ / (7.4 ± 9.2)×10⁻⁴</w:t>
+            </w:r>
+          </w:p>
+        </w:tc>
+        <w:tc>
+          <w:tcPr>
+            <w:tcW w:w="1936" w:type="dxa"/>
+          </w:tcPr>
+          <w:p>
+            <w:pPr>
+              <w:pStyle w:val="ListParagraph"/>
+              <w:spacing w:before="120" w:after="120" w:line="360" w:lineRule="auto"/>
+              <w:ind w:left="0"/>
+              <w:jc w:val="center"/>
+              <w:rPr>
+                <w:rFonts w:ascii="Times New Roman" w:hAnsi="Times New Roman" w:cs="Times New Roman"/>
+                <w:iCs/>
+                <w:color w:val="000000" w:themeColor="text1"/>
+                <w:sz w:val="15"/>
+                <w:szCs w:val="15"/>
+              </w:rPr>
+            </w:pPr>
+            <w:r>
+              <w:rPr>
+                <w:rFonts w:ascii="Times New Roman" w:hAnsi="Times New Roman" w:cs="Times New Roman"/>
+                <w:iCs/>
+                <w:color w:val="000000" w:themeColor="text1"/>
+                <w:sz w:val="15"/>
+                <w:szCs w:val="15"/>
+              </w:rPr>
+              <w:t xml:space="preserve">55 / 75 / 87 </w:t>
+            </w:r>
+          </w:p>
+        </w:tc>
+        <w:tc>
+          <w:tcPr>
+            <w:tcW w:w="1483" w:type="dxa"/>
+          </w:tcPr>
+          <w:p>
+            <w:pPr>
+              <w:pStyle w:val="ListParagraph"/>
+              <w:spacing w:before="120" w:after="120" w:line="360" w:lineRule="auto"/>
+              <w:ind w:left="0"/>
+              <w:jc w:val="center"/>
+              <w:rPr>
+                <w:rFonts w:ascii="Times New Roman" w:hAnsi="Times New Roman" w:cs="Times New Roman"/>
+                <w:iCs/>
+                <w:color w:val="000000" w:themeColor="text1"/>
+                <w:sz w:val="15"/>
+                <w:szCs w:val="15"/>
+              </w:rPr>
+            </w:pPr>
+            <w:r>
+              <w:rPr>
+                <w:rFonts w:ascii="Times New Roman" w:hAnsi="Times New Roman" w:cs="Times New Roman"/>
+                <w:iCs/>
+                <w:color w:val="000000" w:themeColor="text1"/>
+                <w:sz w:val="15"/>
+                <w:szCs w:val="15"/>
+              </w:rPr>
+              <w:t>Verified</w:t>
+            </w:r>
+          </w:p>
+        </w:tc>
+      </w:tr>
+      <w:tr>
+        <w:trPr>
+          <w:trHeight w:val="629"/>
+        </w:trPr>
+        <w:tc>
+          <w:tcPr>
+            <w:tcW w:w="1710" w:type="dxa"/>
+          </w:tcPr>
+          <w:p>
+            <w:pPr>
+              <w:pStyle w:val="ListParagraph"/>
+              <w:spacing w:before="120" w:after="120" w:line="360" w:lineRule="auto"/>
+              <w:ind w:left="0"/>
+              <w:jc w:val="center"/>
+              <w:rPr>
+                <w:rFonts w:ascii="Times New Roman" w:hAnsi="Times New Roman" w:cs="Times New Roman"/>
+                <w:iCs/>
+                <w:color w:val="000000" w:themeColor="text1"/>
+                <w:sz w:val="15"/>
+                <w:szCs w:val="15"/>
+              </w:rPr>
+            </w:pPr>
+            <w:r>
+              <w:rPr>
+                <w:rFonts w:ascii="Times New Roman" w:hAnsi="Times New Roman" w:cs="Times New Roman"/>
+                <w:iCs/>
+                <w:color w:val="000000" w:themeColor="text1"/>
+                <w:sz w:val="15"/>
+                <w:szCs w:val="15"/>
+              </w:rPr>
+              <w:t>w/o stability screening</w:t>
+            </w:r>
+          </w:p>
+        </w:tc>
+        <w:tc>
+          <w:tcPr>
+            <w:tcW w:w="2409" w:type="dxa"/>
+          </w:tcPr>
           <w:p>
             <w:pPr>
               <w:pStyle w:val="ListParagraph"/>
@@ -5861,7 +5985,7 @@
                 <w:sz w:val="15"/>
                 <w:szCs w:val="15"/>
               </w:rPr>
-              <w:t xml:space="preserve">0.11 (±0.60) / </w:t>
+              <w:t>2.57 (±1.30) /</w:t>
             </w:r>
           </w:p>
           <w:p>
@@ -5886,14 +6010,9 @@
                 <w:sz w:val="15"/>
                 <w:szCs w:val="15"/>
               </w:rPr>
-              <w:t>0.73 (±0.76)</w:t>
-            </w:r>
-          </w:p>
-        </w:tc>
-        <w:tc>
-          <w:tcPr>
-            <w:tcW w:w="1641" w:type="dxa"/>
-          </w:tcPr>
+              <w:t xml:space="preserve"> 0.24 (±1.09) / </w:t>
+            </w:r>
+          </w:p>
           <w:p>
             <w:pPr>
               <w:pStyle w:val="ListParagraph"/>
@@ -5916,9 +6035,14 @@
                 <w:sz w:val="15"/>
                 <w:szCs w:val="15"/>
               </w:rPr>
-              <w:t xml:space="preserve">0.0086 / </w:t>
-            </w:r>
-          </w:p>
+              <w:t>1.30 (±1.05)</w:t>
+            </w:r>
+          </w:p>
+        </w:tc>
+        <w:tc>
+          <w:tcPr>
+            <w:tcW w:w="1641" w:type="dxa"/>
+          </w:tcPr>
           <w:p>
             <w:pPr>
               <w:pStyle w:val="ListParagraph"/>
@@ -5935,21 +6059,142 @@
             </w:pPr>
             <w:r>
               <w:rPr>
+                <w:rFonts w:ascii="Times New Roman" w:hAnsi="Times New Roman"/>
+                <w:sz w:val="15"/>
+              </w:rPr>
+              <w:t>(2.7 ± 2.4)×10⁻³ / (4.9 ± 5.2)×10⁻⁴ / (1.9 ± 2.2)×10⁻³</w:t>
+            </w:r>
+          </w:p>
+        </w:tc>
+        <w:tc>
+          <w:tcPr>
+            <w:tcW w:w="1936" w:type="dxa"/>
+          </w:tcPr>
+          <w:p>
+            <w:pPr>
+              <w:pStyle w:val="ListParagraph"/>
+              <w:spacing w:before="120" w:after="120" w:line="360" w:lineRule="auto"/>
+              <w:ind w:left="0"/>
+              <w:jc w:val="center"/>
+              <w:rPr>
+                <w:rFonts w:ascii="Times New Roman" w:hAnsi="Times New Roman" w:cs="Times New Roman"/>
+                <w:iCs/>
+                <w:color w:val="000000" w:themeColor="text1"/>
+                <w:sz w:val="15"/>
+                <w:szCs w:val="15"/>
+              </w:rPr>
+            </w:pPr>
+            <w:r>
+              <w:rPr>
+                <w:rFonts w:ascii="Times New Roman" w:hAnsi="Times New Roman" w:cs="Times New Roman"/>
+                <w:iCs/>
+                <w:color w:val="000000" w:themeColor="text1"/>
+                <w:sz w:val="15"/>
+                <w:szCs w:val="15"/>
+              </w:rPr>
+              <w:t>53 / 79 / 81</w:t>
+            </w:r>
+          </w:p>
+          <w:p>
+            <w:pPr>
+              <w:pStyle w:val="ListParagraph"/>
+              <w:spacing w:before="120" w:after="120" w:line="360" w:lineRule="auto"/>
+              <w:ind w:left="0"/>
+              <w:jc w:val="center"/>
+              <w:rPr>
+                <w:rFonts w:ascii="Times New Roman" w:hAnsi="Times New Roman" w:cs="Times New Roman"/>
+                <w:iCs/>
+                <w:color w:val="000000" w:themeColor="text1"/>
+                <w:sz w:val="15"/>
+                <w:szCs w:val="15"/>
+              </w:rPr>
+            </w:pPr>
+          </w:p>
+        </w:tc>
+        <w:tc>
+          <w:tcPr>
+            <w:tcW w:w="1483" w:type="dxa"/>
+          </w:tcPr>
+          <w:p>
+            <w:pPr>
+              <w:pStyle w:val="ListParagraph"/>
+              <w:spacing w:before="120" w:after="120" w:line="360" w:lineRule="auto"/>
+              <w:ind w:left="0"/>
+              <w:jc w:val="center"/>
+              <w:rPr>
+                <w:rFonts w:ascii="Times New Roman" w:hAnsi="Times New Roman" w:cs="Times New Roman"/>
+                <w:iCs/>
+                <w:color w:val="000000" w:themeColor="text1"/>
+                <w:sz w:val="15"/>
+                <w:szCs w:val="15"/>
+              </w:rPr>
+            </w:pPr>
+            <w:r>
+              <w:rPr>
+                <w:rFonts w:ascii="Times New Roman" w:hAnsi="Times New Roman" w:cs="Times New Roman"/>
+                <w:iCs/>
+                <w:color w:val="000000" w:themeColor="text1"/>
+                <w:sz w:val="15"/>
+                <w:szCs w:val="15"/>
+              </w:rPr>
+              <w:t>Verified</w:t>
+            </w:r>
+          </w:p>
+        </w:tc>
+      </w:tr>
+      <w:tr>
+        <w:trPr>
+          <w:trHeight w:val="953"/>
+        </w:trPr>
+        <w:tc>
+          <w:tcPr>
+            <w:tcW w:w="1710" w:type="dxa"/>
+          </w:tcPr>
+          <w:p>
+            <w:pPr>
+              <w:pStyle w:val="ListParagraph"/>
+              <w:spacing w:before="120" w:after="120" w:line="360" w:lineRule="auto"/>
+              <w:ind w:left="0"/>
+              <w:jc w:val="center"/>
+              <w:rPr>
+                <w:rFonts w:ascii="Times New Roman" w:hAnsi="Times New Roman" w:cs="Times New Roman"/>
+                <w:iCs/>
+                <w:color w:val="000000" w:themeColor="text1"/>
+                <w:sz w:val="15"/>
+                <w:szCs w:val="15"/>
+              </w:rPr>
+            </w:pPr>
+            <w:r>
+              <w:rPr>
+                <w:rFonts w:ascii="Times New Roman" w:hAnsi="Times New Roman" w:cs="Times New Roman"/>
+                <w:iCs/>
+                <w:color w:val="000000" w:themeColor="text1"/>
+                <w:sz w:val="15"/>
+                <w:szCs w:val="15"/>
+              </w:rPr>
+              <w:t>w/o exploitability verification</w:t>
+            </w:r>
+          </w:p>
+        </w:tc>
+        <w:tc>
+          <w:tcPr>
+            <w:tcW w:w="2409" w:type="dxa"/>
+          </w:tcPr>
+          <w:p>
+            <w:pPr>
+              <w:pStyle w:val="ListParagraph"/>
+              <w:spacing w:before="120" w:after="120" w:line="360" w:lineRule="auto"/>
+              <w:ind w:left="0"/>
+              <w:jc w:val="center"/>
+              <w:rPr>
                 <w:rFonts w:ascii="Times New Roman" w:hAnsi="Times New Roman" w:cs="Times New Roman"/>
                 <w:iCs/>
                 <w:color w:val="EE0000"/>
                 <w:sz w:val="15"/>
                 <w:szCs w:val="15"/>
               </w:rPr>
-              <w:t xml:space="preserve">0.0084 / </w:t>
-            </w:r>
-          </w:p>
-          <w:p>
-            <w:pPr>
-              <w:pStyle w:val="ListParagraph"/>
-              <w:spacing w:before="120" w:after="120" w:line="360" w:lineRule="auto"/>
-              <w:ind w:left="0"/>
-              <w:jc w:val="center"/>
+            </w:pPr>
+            <w:r>
               <w:rPr>
                 <w:rFonts w:ascii="Times New Roman" w:hAnsi="Times New Roman" w:cs="Times New Roman"/>
                 <w:iCs/>
@@ -5957,8 +6202,15 @@
                 <w:sz w:val="15"/>
                 <w:szCs w:val="15"/>
               </w:rPr>
-            </w:pPr>
-            <w:r>
+              <w:t xml:space="preserve">0.85 (±3.53) / </w:t>
+            </w:r>
+          </w:p>
+          <w:p>
+            <w:pPr>
+              <w:pStyle w:val="ListParagraph"/>
+              <w:spacing w:before="120" w:after="120" w:line="360" w:lineRule="auto"/>
+              <w:ind w:left="0"/>
+              <w:jc w:val="center"/>
               <w:rPr>
                 <w:rFonts w:ascii="Times New Roman" w:hAnsi="Times New Roman" w:cs="Times New Roman"/>
                 <w:iCs/>
@@ -5966,115 +6218,8 @@
                 <w:sz w:val="15"/>
                 <w:szCs w:val="15"/>
               </w:rPr>
-              <w:t>0.0064 ⁱⁿ</w:t>
-            </w:r>
-          </w:p>
-        </w:tc>
-        <w:tc>
-          <w:tcPr>
-            <w:tcW w:w="1936" w:type="dxa"/>
-          </w:tcPr>
-          <w:p>
-            <w:pPr>
-              <w:pStyle w:val="ListParagraph"/>
-              <w:spacing w:before="120" w:after="120" w:line="360" w:lineRule="auto"/>
-              <w:ind w:left="0"/>
-              <w:jc w:val="center"/>
-              <w:rPr>
-                <w:rFonts w:ascii="Times New Roman" w:hAnsi="Times New Roman" w:cs="Times New Roman"/>
-                <w:iCs/>
-                <w:color w:val="000000" w:themeColor="text1"/>
-                <w:sz w:val="15"/>
-                <w:szCs w:val="15"/>
-              </w:rPr>
-            </w:pPr>
-            <w:r>
-              <w:rPr>
-                <w:rFonts w:ascii="Times New Roman" w:hAnsi="Times New Roman" w:cs="Times New Roman"/>
-                <w:iCs/>
-                <w:color w:val="000000" w:themeColor="text1"/>
-                <w:sz w:val="15"/>
-                <w:szCs w:val="15"/>
-              </w:rPr>
-              <w:t xml:space="preserve">55 / 75 / 87 </w:t>
-            </w:r>
-          </w:p>
-        </w:tc>
-        <w:tc>
-          <w:tcPr>
-            <w:tcW w:w="1483" w:type="dxa"/>
-          </w:tcPr>
-          <w:p>
-            <w:pPr>
-              <w:pStyle w:val="ListParagraph"/>
-              <w:spacing w:before="120" w:after="120" w:line="360" w:lineRule="auto"/>
-              <w:ind w:left="0"/>
-              <w:jc w:val="center"/>
-              <w:rPr>
-                <w:rFonts w:ascii="Times New Roman" w:hAnsi="Times New Roman" w:cs="Times New Roman"/>
-                <w:iCs/>
-                <w:color w:val="000000" w:themeColor="text1"/>
-                <w:sz w:val="15"/>
-                <w:szCs w:val="15"/>
-              </w:rPr>
-            </w:pPr>
-            <w:r>
-              <w:rPr>
-                <w:rFonts w:ascii="Times New Roman" w:hAnsi="Times New Roman" w:cs="Times New Roman"/>
-                <w:iCs/>
-                <w:color w:val="000000" w:themeColor="text1"/>
-                <w:sz w:val="15"/>
-                <w:szCs w:val="15"/>
-              </w:rPr>
-              <w:t>Verified</w:t>
-            </w:r>
-          </w:p>
-        </w:tc>
-      </w:tr>
-      <w:tr>
-        <w:trPr>
-          <w:trHeight w:val="629"/>
-        </w:trPr>
-        <w:tc>
-          <w:tcPr>
-            <w:tcW w:w="1710" w:type="dxa"/>
-          </w:tcPr>
-          <w:p>
-            <w:pPr>
-              <w:pStyle w:val="ListParagraph"/>
-              <w:spacing w:before="120" w:after="120" w:line="360" w:lineRule="auto"/>
-              <w:ind w:left="0"/>
-              <w:jc w:val="center"/>
-              <w:rPr>
-                <w:rFonts w:ascii="Times New Roman" w:hAnsi="Times New Roman" w:cs="Times New Roman"/>
-                <w:iCs/>
-                <w:color w:val="000000" w:themeColor="text1"/>
-                <w:sz w:val="15"/>
-                <w:szCs w:val="15"/>
-              </w:rPr>
-            </w:pPr>
-            <w:r>
-              <w:rPr>
-                <w:rFonts w:ascii="Times New Roman" w:hAnsi="Times New Roman" w:cs="Times New Roman"/>
-                <w:iCs/>
-                <w:color w:val="000000" w:themeColor="text1"/>
-                <w:sz w:val="15"/>
-                <w:szCs w:val="15"/>
-              </w:rPr>
-              <w:t>w/o stability screening</w:t>
-            </w:r>
-          </w:p>
-        </w:tc>
-        <w:tc>
-          <w:tcPr>
-            <w:tcW w:w="2409" w:type="dxa"/>
-          </w:tcPr>
-          <w:p>
-            <w:pPr>
-              <w:pStyle w:val="ListParagraph"/>
-              <w:spacing w:before="120" w:after="120" w:line="360" w:lineRule="auto"/>
-              <w:ind w:left="0"/>
-              <w:jc w:val="center"/>
+            </w:pPr>
+            <w:r>
               <w:rPr>
                 <w:rFonts w:ascii="Times New Roman" w:hAnsi="Times New Roman" w:cs="Times New Roman"/>
                 <w:iCs/>
@@ -6082,8 +6227,15 @@
                 <w:sz w:val="15"/>
                 <w:szCs w:val="15"/>
               </w:rPr>
-            </w:pPr>
-            <w:r>
+              <w:t xml:space="preserve">3.31 (±1.38) / </w:t>
+            </w:r>
+          </w:p>
+          <w:p>
+            <w:pPr>
+              <w:pStyle w:val="ListParagraph"/>
+              <w:spacing w:before="120" w:after="120" w:line="360" w:lineRule="auto"/>
+              <w:ind w:left="0"/>
+              <w:jc w:val="center"/>
               <w:rPr>
                 <w:rFonts w:ascii="Times New Roman" w:hAnsi="Times New Roman" w:cs="Times New Roman"/>
                 <w:iCs/>
@@ -6091,15 +6243,8 @@
                 <w:sz w:val="15"/>
                 <w:szCs w:val="15"/>
               </w:rPr>
-              <w:t>2.57 (±1.30) /</w:t>
-            </w:r>
-          </w:p>
-          <w:p>
-            <w:pPr>
-              <w:pStyle w:val="ListParagraph"/>
-              <w:spacing w:before="120" w:after="120" w:line="360" w:lineRule="auto"/>
-              <w:ind w:left="0"/>
-              <w:jc w:val="center"/>
+            </w:pPr>
+            <w:r>
               <w:rPr>
                 <w:rFonts w:ascii="Times New Roman" w:hAnsi="Times New Roman" w:cs="Times New Roman"/>
                 <w:iCs/>
@@ -6107,8 +6252,20 @@
                 <w:sz w:val="15"/>
                 <w:szCs w:val="15"/>
               </w:rPr>
-            </w:pPr>
-            <w:r>
+              <w:t>0.58 (±1.73)</w:t>
+            </w:r>
+          </w:p>
+        </w:tc>
+        <w:tc>
+          <w:tcPr>
+            <w:tcW w:w="1641" w:type="dxa"/>
+          </w:tcPr>
+          <w:p>
+            <w:pPr>
+              <w:pStyle w:val="ListParagraph"/>
+              <w:spacing w:before="120" w:after="120" w:line="360" w:lineRule="auto"/>
+              <w:ind w:left="0"/>
+              <w:jc w:val="center"/>
               <w:rPr>
                 <w:rFonts w:ascii="Times New Roman" w:hAnsi="Times New Roman" w:cs="Times New Roman"/>
                 <w:iCs/>
@@ -6116,9 +6273,20 @@
                 <w:sz w:val="15"/>
                 <w:szCs w:val="15"/>
               </w:rPr>
-              <w:t xml:space="preserve"> 0.24 (±1.09) / </w:t>
-            </w:r>
-          </w:p>
+            </w:pPr>
+            <w:r>
+              <w:rPr>
+                <w:rFonts w:ascii="Times New Roman" w:hAnsi="Times New Roman"/>
+                <w:sz w:val="15"/>
+              </w:rPr>
+              <w:t>(5.5 ± 5.9)×10⁻³ / (4.9 ± 4.5)×10⁻³ / (1.9 ± 2.7)×10⁻³</w:t>
+            </w:r>
+          </w:p>
+        </w:tc>
+        <w:tc>
+          <w:tcPr>
+            <w:tcW w:w="1936" w:type="dxa"/>
+          </w:tcPr>
           <w:p>
             <w:pPr>
               <w:pStyle w:val="ListParagraph"/>
@@ -6126,28 +6294,38 @@
               <w:ind w:left="0"/>
               <w:jc w:val="center"/>
               <w:rPr>
+                <w:rFonts w:ascii="Times New Roman" w:hAnsi="Times New Roman" w:cs="Times New Roman" w:hint="eastAsia"/>
+                <w:iCs/>
+                <w:color w:val="000000" w:themeColor="text1"/>
+                <w:sz w:val="15"/>
+                <w:szCs w:val="15"/>
+              </w:rPr>
+            </w:pPr>
+            <w:r>
+              <w:rPr>
                 <w:rFonts w:ascii="Times New Roman" w:hAnsi="Times New Roman" w:cs="Times New Roman"/>
                 <w:iCs/>
-                <w:color w:val="EE0000"/>
+                <w:color w:val="000000" w:themeColor="text1"/>
                 <w:sz w:val="15"/>
                 <w:szCs w:val="15"/>
               </w:rPr>
-            </w:pPr>
-            <w:r>
-              <w:rPr>
-                <w:rFonts w:ascii="Times New Roman" w:hAnsi="Times New Roman" w:cs="Times New Roman"/>
+              <w:t xml:space="preserve">— </w:t>
+            </w:r>
+            <w:r>
+              <w:rPr>
+                <w:rFonts w:ascii="Times New Roman" w:hAnsi="Times New Roman" w:cs="Times New Roman" w:hint="eastAsia"/>
                 <w:iCs/>
-                <w:color w:val="EE0000"/>
+                <w:color w:val="000000" w:themeColor="text1"/>
                 <w:sz w:val="15"/>
                 <w:szCs w:val="15"/>
               </w:rPr>
-              <w:t>1.30 (±1.05)</w:t>
-            </w:r>
-          </w:p>
-        </w:tc>
-        <w:tc>
-          <w:tcPr>
-            <w:tcW w:w="1641" w:type="dxa"/>
+              <w:t>N/A</w:t>
+            </w:r>
+          </w:p>
+        </w:tc>
+        <w:tc>
+          <w:tcPr>
+            <w:tcW w:w="1483" w:type="dxa"/>
           </w:tcPr>
           <w:p>
             <w:pPr>
@@ -6158,7 +6336,7 @@
               <w:rPr>
                 <w:rFonts w:ascii="Times New Roman" w:hAnsi="Times New Roman" w:cs="Times New Roman"/>
                 <w:iCs/>
-                <w:color w:val="EE0000"/>
+                <w:color w:val="000000" w:themeColor="text1"/>
                 <w:sz w:val="15"/>
                 <w:szCs w:val="15"/>
               </w:rPr>
@@ -6167,356 +6345,25 @@
               <w:rPr>
                 <w:rFonts w:ascii="Times New Roman" w:hAnsi="Times New Roman" w:cs="Times New Roman"/>
                 <w:iCs/>
-                <w:color w:val="EE0000"/>
+                <w:color w:val="000000" w:themeColor="text1"/>
                 <w:sz w:val="15"/>
                 <w:szCs w:val="15"/>
               </w:rPr>
-              <w:t xml:space="preserve">0.0096 / </w:t>
-            </w:r>
-          </w:p>
-          <w:p>
-            <w:pPr>
-              <w:pStyle w:val="ListParagraph"/>
-              <w:spacing w:before="120" w:after="120" w:line="360" w:lineRule="auto"/>
-              <w:ind w:left="0"/>
-              <w:jc w:val="center"/>
-              <w:rPr>
-                <w:rFonts w:ascii="Times New Roman" w:hAnsi="Times New Roman" w:cs="Times New Roman"/>
-                <w:iCs/>
-                <w:color w:val="EE0000"/>
-                <w:sz w:val="15"/>
-                <w:szCs w:val="15"/>
-              </w:rPr>
-            </w:pPr>
-            <w:r>
-              <w:rPr>
-                <w:rFonts w:ascii="Times New Roman" w:hAnsi="Times New Roman" w:cs="Times New Roman"/>
-                <w:iCs/>
-                <w:color w:val="EE0000"/>
-                <w:sz w:val="15"/>
-                <w:szCs w:val="15"/>
-              </w:rPr>
-              <w:t xml:space="preserve">0.0067 / </w:t>
-            </w:r>
-          </w:p>
-          <w:p>
-            <w:pPr>
-              <w:pStyle w:val="ListParagraph"/>
-              <w:spacing w:before="120" w:after="120" w:line="360" w:lineRule="auto"/>
-              <w:ind w:left="0"/>
-              <w:jc w:val="center"/>
-              <w:rPr>
-                <w:rFonts w:ascii="Times New Roman" w:hAnsi="Times New Roman" w:cs="Times New Roman"/>
-                <w:iCs/>
-                <w:color w:val="EE0000"/>
-                <w:sz w:val="15"/>
-                <w:szCs w:val="15"/>
-              </w:rPr>
-            </w:pPr>
-            <w:r>
-              <w:rPr>
-                <w:rFonts w:ascii="Times New Roman" w:hAnsi="Times New Roman" w:cs="Times New Roman"/>
-                <w:iCs/>
-                <w:color w:val="EE0000"/>
-                <w:sz w:val="15"/>
-                <w:szCs w:val="15"/>
-              </w:rPr>
-              <w:t>0.0077 ⁱⁿ</w:t>
-            </w:r>
-          </w:p>
-        </w:tc>
-        <w:tc>
-          <w:tcPr>
-            <w:tcW w:w="1936" w:type="dxa"/>
-          </w:tcPr>
-          <w:p>
-            <w:pPr>
-              <w:pStyle w:val="ListParagraph"/>
-              <w:spacing w:before="120" w:after="120" w:line="360" w:lineRule="auto"/>
-              <w:ind w:left="0"/>
-              <w:jc w:val="center"/>
-              <w:rPr>
-                <w:rFonts w:ascii="Times New Roman" w:hAnsi="Times New Roman" w:cs="Times New Roman"/>
-                <w:iCs/>
-                <w:color w:val="000000" w:themeColor="text1"/>
-                <w:sz w:val="15"/>
-                <w:szCs w:val="15"/>
-              </w:rPr>
-            </w:pPr>
-            <w:r>
-              <w:rPr>
-                <w:rFonts w:ascii="Times New Roman" w:hAnsi="Times New Roman" w:cs="Times New Roman"/>
-                <w:iCs/>
-                <w:color w:val="000000" w:themeColor="text1"/>
-                <w:sz w:val="15"/>
-                <w:szCs w:val="15"/>
-              </w:rPr>
-              <w:t>53 / 79 / 81</w:t>
-            </w:r>
-          </w:p>
-          <w:p>
-            <w:pPr>
-              <w:pStyle w:val="ListParagraph"/>
-              <w:spacing w:before="120" w:after="120" w:line="360" w:lineRule="auto"/>
-              <w:ind w:left="0"/>
-              <w:jc w:val="center"/>
-              <w:rPr>
-                <w:rFonts w:ascii="Times New Roman" w:hAnsi="Times New Roman" w:cs="Times New Roman"/>
-                <w:iCs/>
-                <w:color w:val="000000" w:themeColor="text1"/>
-                <w:sz w:val="15"/>
-                <w:szCs w:val="15"/>
-              </w:rPr>
-            </w:pPr>
-          </w:p>
-        </w:tc>
-        <w:tc>
-          <w:tcPr>
-            <w:tcW w:w="1483" w:type="dxa"/>
-          </w:tcPr>
-          <w:p>
-            <w:pPr>
-              <w:pStyle w:val="ListParagraph"/>
-              <w:spacing w:before="120" w:after="120" w:line="360" w:lineRule="auto"/>
-              <w:ind w:left="0"/>
-              <w:jc w:val="center"/>
-              <w:rPr>
-                <w:rFonts w:ascii="Times New Roman" w:hAnsi="Times New Roman" w:cs="Times New Roman"/>
-                <w:iCs/>
-                <w:color w:val="000000" w:themeColor="text1"/>
-                <w:sz w:val="15"/>
-                <w:szCs w:val="15"/>
-              </w:rPr>
-            </w:pPr>
-            <w:r>
-              <w:rPr>
-                <w:rFonts w:ascii="Times New Roman" w:hAnsi="Times New Roman" w:cs="Times New Roman"/>
-                <w:iCs/>
-                <w:color w:val="000000" w:themeColor="text1"/>
-                <w:sz w:val="15"/>
-                <w:szCs w:val="15"/>
-              </w:rPr>
-              <w:t>Verified</w:t>
-            </w:r>
-          </w:p>
-        </w:tc>
-      </w:tr>
-      <w:tr>
-        <w:trPr>
-          <w:trHeight w:val="953"/>
-        </w:trPr>
-        <w:tc>
-          <w:tcPr>
-            <w:tcW w:w="1710" w:type="dxa"/>
-          </w:tcPr>
-          <w:p>
-            <w:pPr>
-              <w:pStyle w:val="ListParagraph"/>
-              <w:spacing w:before="120" w:after="120" w:line="360" w:lineRule="auto"/>
-              <w:ind w:left="0"/>
-              <w:jc w:val="center"/>
-              <w:rPr>
-                <w:rFonts w:ascii="Times New Roman" w:hAnsi="Times New Roman" w:cs="Times New Roman"/>
-                <w:iCs/>
-                <w:color w:val="000000" w:themeColor="text1"/>
-                <w:sz w:val="15"/>
-                <w:szCs w:val="15"/>
-              </w:rPr>
-            </w:pPr>
-            <w:r>
-              <w:rPr>
-                <w:rFonts w:ascii="Times New Roman" w:hAnsi="Times New Roman" w:cs="Times New Roman"/>
-                <w:iCs/>
-                <w:color w:val="000000" w:themeColor="text1"/>
-                <w:sz w:val="15"/>
-                <w:szCs w:val="15"/>
-              </w:rPr>
-              <w:t>w/o exploitability verification</w:t>
-            </w:r>
-          </w:p>
-        </w:tc>
-        <w:tc>
-          <w:tcPr>
-            <w:tcW w:w="2409" w:type="dxa"/>
-          </w:tcPr>
-          <w:p>
-            <w:pPr>
-              <w:pStyle w:val="ListParagraph"/>
-              <w:spacing w:before="120" w:after="120" w:line="360" w:lineRule="auto"/>
-              <w:ind w:left="0"/>
-              <w:jc w:val="center"/>
-              <w:rPr>
-                <w:rFonts w:ascii="Times New Roman" w:hAnsi="Times New Roman" w:cs="Times New Roman"/>
-                <w:iCs/>
-                <w:color w:val="EE0000"/>
-                <w:sz w:val="15"/>
-                <w:szCs w:val="15"/>
-              </w:rPr>
-            </w:pPr>
-            <w:r>
-              <w:rPr>
-                <w:rFonts w:ascii="Times New Roman" w:hAnsi="Times New Roman" w:cs="Times New Roman"/>
-                <w:iCs/>
-                <w:color w:val="EE0000"/>
-                <w:sz w:val="15"/>
-                <w:szCs w:val="15"/>
-              </w:rPr>
-              <w:t xml:space="preserve">0.85 (±3.53) / </w:t>
-            </w:r>
-          </w:p>
-          <w:p>
-            <w:pPr>
-              <w:pStyle w:val="ListParagraph"/>
-              <w:spacing w:before="120" w:after="120" w:line="360" w:lineRule="auto"/>
-              <w:ind w:left="0"/>
-              <w:jc w:val="center"/>
-              <w:rPr>
-                <w:rFonts w:ascii="Times New Roman" w:hAnsi="Times New Roman" w:cs="Times New Roman"/>
-                <w:iCs/>
-                <w:color w:val="EE0000"/>
-                <w:sz w:val="15"/>
-                <w:szCs w:val="15"/>
-              </w:rPr>
-            </w:pPr>
-            <w:r>
-              <w:rPr>
-                <w:rFonts w:ascii="Times New Roman" w:hAnsi="Times New Roman" w:cs="Times New Roman"/>
-                <w:iCs/>
-                <w:color w:val="EE0000"/>
-                <w:sz w:val="15"/>
-                <w:szCs w:val="15"/>
-              </w:rPr>
-              <w:t xml:space="preserve">3.31 (±1.38) / </w:t>
-            </w:r>
-          </w:p>
-          <w:p>
-            <w:pPr>
-              <w:pStyle w:val="ListParagraph"/>
-              <w:spacing w:before="120" w:after="120" w:line="360" w:lineRule="auto"/>
-              <w:ind w:left="0"/>
-              <w:jc w:val="center"/>
-              <w:rPr>
-                <w:rFonts w:ascii="Times New Roman" w:hAnsi="Times New Roman" w:cs="Times New Roman"/>
-                <w:iCs/>
-                <w:color w:val="EE0000"/>
-                <w:sz w:val="15"/>
-                <w:szCs w:val="15"/>
-              </w:rPr>
-            </w:pPr>
-            <w:r>
-              <w:rPr>
-                <w:rFonts w:ascii="Times New Roman" w:hAnsi="Times New Roman" w:cs="Times New Roman"/>
-                <w:iCs/>
-                <w:color w:val="EE0000"/>
-                <w:sz w:val="15"/>
-                <w:szCs w:val="15"/>
-              </w:rPr>
-              <w:t>0.58 (±1.73)</w:t>
-            </w:r>
-          </w:p>
-        </w:tc>
-        <w:tc>
-          <w:tcPr>
-            <w:tcW w:w="1641" w:type="dxa"/>
-          </w:tcPr>
-          <w:p>
-            <w:pPr>
-              <w:pStyle w:val="ListParagraph"/>
-              <w:spacing w:before="120" w:after="120" w:line="360" w:lineRule="auto"/>
-              <w:ind w:left="0"/>
-              <w:jc w:val="center"/>
-              <w:rPr>
-                <w:rFonts w:ascii="Times New Roman" w:hAnsi="Times New Roman" w:cs="Times New Roman"/>
-                <w:iCs/>
-                <w:color w:val="EE0000"/>
-                <w:sz w:val="15"/>
-                <w:szCs w:val="15"/>
-              </w:rPr>
-            </w:pPr>
-            <w:r>
-              <w:rPr>
-                <w:rFonts w:ascii="Times New Roman" w:hAnsi="Times New Roman" w:cs="Times New Roman"/>
-                <w:iCs/>
-                <w:color w:val="EE0000"/>
-                <w:sz w:val="15"/>
-                <w:szCs w:val="15"/>
-              </w:rPr>
-              <w:t>0.0109 (±0.0071) / 0.0086 (±0.0055) / 0.0044 (±0.0031) ᵐᶜ</w:t>
-            </w:r>
-          </w:p>
-        </w:tc>
-        <w:tc>
-          <w:tcPr>
-            <w:tcW w:w="1936" w:type="dxa"/>
-          </w:tcPr>
-          <w:p>
-            <w:pPr>
-              <w:pStyle w:val="ListParagraph"/>
-              <w:spacing w:before="120" w:after="120" w:line="360" w:lineRule="auto"/>
-              <w:ind w:left="0"/>
-              <w:jc w:val="center"/>
-              <w:rPr>
-                <w:rFonts w:ascii="Times New Roman" w:hAnsi="Times New Roman" w:cs="Times New Roman" w:hint="eastAsia"/>
-                <w:iCs/>
-                <w:color w:val="000000" w:themeColor="text1"/>
-                <w:sz w:val="15"/>
-                <w:szCs w:val="15"/>
-              </w:rPr>
-            </w:pPr>
-            <w:r>
-              <w:rPr>
-                <w:rFonts w:ascii="Times New Roman" w:hAnsi="Times New Roman" w:cs="Times New Roman"/>
-                <w:iCs/>
-                <w:color w:val="000000" w:themeColor="text1"/>
-                <w:sz w:val="15"/>
-                <w:szCs w:val="15"/>
-              </w:rPr>
-              <w:t xml:space="preserve">— </w:t>
-            </w:r>
-            <w:r>
-              <w:rPr>
-                <w:rFonts w:ascii="Times New Roman" w:hAnsi="Times New Roman" w:cs="Times New Roman" w:hint="eastAsia"/>
-                <w:iCs/>
-                <w:color w:val="000000" w:themeColor="text1"/>
-                <w:sz w:val="15"/>
-                <w:szCs w:val="15"/>
-              </w:rPr>
-              <w:t>N/A</w:t>
-            </w:r>
-          </w:p>
-        </w:tc>
-        <w:tc>
-          <w:tcPr>
-            <w:tcW w:w="1483" w:type="dxa"/>
-          </w:tcPr>
-          <w:p>
-            <w:pPr>
-              <w:pStyle w:val="ListParagraph"/>
-              <w:spacing w:before="120" w:after="120" w:line="360" w:lineRule="auto"/>
-              <w:ind w:left="0"/>
-              <w:jc w:val="center"/>
-              <w:rPr>
-                <w:rFonts w:ascii="Times New Roman" w:hAnsi="Times New Roman" w:cs="Times New Roman"/>
-                <w:iCs/>
-                <w:color w:val="000000" w:themeColor="text1"/>
-                <w:sz w:val="15"/>
-                <w:szCs w:val="15"/>
-              </w:rPr>
-            </w:pPr>
-            <w:r>
-              <w:rPr>
-                <w:rFonts w:ascii="Times New Roman" w:hAnsi="Times New Roman" w:cs="Times New Roman"/>
-                <w:iCs/>
-                <w:color w:val="000000" w:themeColor="text1"/>
-                <w:sz w:val="15"/>
-                <w:szCs w:val="15"/>
-              </w:rPr>
               <w:t>Reached budget</w:t>
             </w:r>
           </w:p>
         </w:tc>
       </w:tr>
     </w:tbl>
+    <w:p>
+      <w:r>
+        <w:rPr>
+          <w:i/>
+          <w:sz w:val="16"/>
+        </w:rPr>
+        <w:t>Exploitability = maximum unilateral best-response gain at the reported (polished) profile, deterministic estimator (exp_det), reported as mean ± std over 5 seeds; all rows are two-player.</w:t>
+      </w:r>
+    </w:p>
     <w:p>
       <w:pPr>
         <w:pStyle w:val="ListParagraph"/>
@@ -10330,11 +10177,9 @@
             </w:pPr>
             <w:r>
               <w:rPr>
-                <w:color w:val="EE0000"/>
-                <w:sz w:val="18"/>
-                <w:szCs w:val="18"/>
-              </w:rPr>
-              <w:t>8.6×10⁻⁵ ᵈᵉᵗ [0.009]</w:t>
+                <w:sz w:val="18"/>
+              </w:rPr>
+              <w:t>(8.6 ± 0.8)×10⁻⁵</w:t>
             </w:r>
           </w:p>
         </w:tc>
@@ -10527,32 +10372,10 @@
             </w:pPr>
             <w:r>
               <w:rPr>
-                <w:color w:val="EE0000"/>
-                <w:sz w:val="18"/>
-                <w:szCs w:val="18"/>
-              </w:rPr>
-              <w:br/>
-              <w:t>2.7×10⁻⁵ </w:t>
-            </w:r>
-            <w:r>
-              <w:rPr>
-                <w:rStyle w:val="wordanimatingyu34g11"/>
-                <w:color w:val="EE0000"/>
-                <w:sz w:val="18"/>
-                <w:szCs w:val="18"/>
-              </w:rPr>
-              <w:t>ᵈᵉᵗ [0.008]</w:t>
-            </w:r>
-          </w:p>
-          <w:p>
-            <w:pPr>
-              <w:jc w:val="center"/>
-              <w:rPr>
-                <w:color w:val="EE0000"/>
-                <w:sz w:val="18"/>
-                <w:szCs w:val="18"/>
-              </w:rPr>
-            </w:pPr>
+                <w:sz w:val="18"/>
+              </w:rPr>
+              <w:t>(2.8 ± 0.7)×10⁻⁵</w:t>
+            </w:r>
           </w:p>
         </w:tc>
       </w:tr>
@@ -10744,11 +10567,9 @@
             </w:pPr>
             <w:r>
               <w:rPr>
-                <w:color w:val="EE0000"/>
-                <w:sz w:val="18"/>
-                <w:szCs w:val="18"/>
-              </w:rPr>
-              <w:t>1.1×10⁻⁵ ᵈᵉᵗ [0.006]</w:t>
+                <w:sz w:val="18"/>
+              </w:rPr>
+              <w:t>(1.2 ± 0.3)×10⁻⁵</w:t>
             </w:r>
           </w:p>
         </w:tc>
@@ -10941,11 +10762,9 @@
             </w:pPr>
             <w:r>
               <w:rPr>
-                <w:color w:val="EE0000"/>
-                <w:sz w:val="18"/>
-                <w:szCs w:val="18"/>
-              </w:rPr>
-              <w:t>0.0008 ᵃ [0.009]</w:t>
+                <w:sz w:val="18"/>
+              </w:rPr>
+              <w:t>8.0×10⁻⁴</w:t>
             </w:r>
           </w:p>
         </w:tc>
@@ -11138,11 +10957,9 @@
             </w:pPr>
             <w:r>
               <w:rPr>
-                <w:color w:val="EE0000"/>
-                <w:sz w:val="18"/>
-                <w:szCs w:val="18"/>
-              </w:rPr>
-              <w:t>0.0007 ᵃ [0.005]</w:t>
+                <w:sz w:val="18"/>
+              </w:rPr>
+              <w:t>7.0×10⁻⁴</w:t>
             </w:r>
           </w:p>
         </w:tc>
@@ -11389,11 +11206,9 @@
             </w:pPr>
             <w:r>
               <w:rPr>
-                <w:color w:val="EE0000"/>
-                <w:sz w:val="18"/>
-                <w:szCs w:val="18"/>
-              </w:rPr>
-              <w:t>0.0006 ᵃ [0.002]</w:t>
+                <w:sz w:val="18"/>
+              </w:rPr>
+              <w:t>6.0×10⁻⁴</w:t>
             </w:r>
           </w:p>
         </w:tc>
@@ -11640,11 +11455,9 @@
             </w:pPr>
             <w:r>
               <w:rPr>
-                <w:color w:val="EE0000"/>
-                <w:sz w:val="18"/>
-                <w:szCs w:val="18"/>
-              </w:rPr>
-              <w:t>0.0002 ᵃ [0.002]</w:t>
+                <w:sz w:val="18"/>
+              </w:rPr>
+              <w:t>2.0×10⁻⁴</w:t>
             </w:r>
           </w:p>
         </w:tc>
@@ -11837,11 +11650,9 @@
             </w:pPr>
             <w:r>
               <w:rPr>
-                <w:color w:val="EE0000"/>
-                <w:sz w:val="18"/>
-                <w:szCs w:val="18"/>
-              </w:rPr>
-              <w:t>0.0010 ᵃ [0.029]</w:t>
+                <w:sz w:val="18"/>
+              </w:rPr>
+              <w:t>1.0×10⁻³</w:t>
             </w:r>
           </w:p>
         </w:tc>
@@ -12034,16 +11845,23 @@
             </w:pPr>
             <w:r>
               <w:rPr>
-                <w:color w:val="EE0000"/>
-                <w:sz w:val="18"/>
-                <w:szCs w:val="18"/>
-              </w:rPr>
-              <w:t>0.0005 ᵃ [0.026]</w:t>
+                <w:sz w:val="18"/>
+              </w:rPr>
+              <w:t>5.0×10⁻⁴</w:t>
             </w:r>
           </w:p>
         </w:tc>
       </w:tr>
     </w:tbl>
+    <w:p>
+      <w:r>
+        <w:rPr>
+          <w:i/>
+          <w:sz w:val="16"/>
+        </w:rPr>
+        <w:t>Exploitability = maximum unilateral best-response gain at the reported (polished) profile. Two-player rows: deterministic estimator (exp_det), mean ± std over 5 seeds. Multi-player / heterogeneous rows: Monte-Carlo frozen-profile estimate (M = 2×10⁵).</w:t>
+      </w:r>
+    </w:p>
     <w:p>
       <w:pPr>
         <w:pStyle w:val="NormalWeb"/>

</xml_diff>